<commit_message>
refactor: make node service configuration driven
</commit_message>
<xml_diff>
--- a/docs/architecture/v2/RoboGuide_Architecture_Baseline_V2.docx
+++ b/docs/architecture/v2/RoboGuide_Architecture_Baseline_V2.docx
@@ -7583,6 +7583,93 @@
     </w:p>
     <w:p>
       <w:pPr>
+        <w:pStyle w:val="Heading2"/>
+        <w:keepNext/>
+      </w:pPr>
+      <w:r>
+        <w:t>11.1 Node-side Integration Boundary</w:t>
+      </w:r>
+    </w:p>
+    <w:p>
+      <w:r>
+        <w:rPr>
+          <w:rFonts w:ascii="Noto Sans CJK SC" w:hAnsi="Noto Sans CJK SC" w:eastAsia="Noto Sans CJK SC"/>
+          <w:b w:val="0"/>
+          <w:color w:val="1F2933"/>
+          <w:sz w:val="21"/>
+        </w:rPr>
+        <w:t>每台节点机器只运行一个 RoboGuide-side 常驻服务 roboguide-node。它通过本地配置驱动内部声明式 Local Integration Engine，可聚合一个或多个 Local Embodied Systems；Adapter 是该引擎中的配置与映射边界，不是按 EAIOS 部署的独立服务或编译期插件。</w:t>
+      </w:r>
+    </w:p>
+    <w:tbl>
+      <w:tblPr>
+        <w:tblW w:type="auto" w:w="0"/>
+        <w:jc w:val="center"/>
+        <w:tblLayout w:type="fixed"/>
+        <w:tblLook w:firstColumn="1" w:firstRow="1" w:lastColumn="0" w:lastRow="0" w:noHBand="0" w:noVBand="1" w:val="04A0"/>
+      </w:tblPr>
+      <w:tblGrid>
+        <w:gridCol w:w="8901"/>
+      </w:tblGrid>
+      <w:tr>
+        <w:trPr>
+          <w:cantSplit/>
+        </w:trPr>
+        <w:tc>
+          <w:tcPr>
+            <w:tcW w:type="dxa" w:w="9858"/>
+            <w:shd w:fill="EAF6EF"/>
+            <w:tcBorders>
+              <w:top w:val="single" w:sz="3" w:color="E1E6EA"/>
+              <w:left w:val="single" w:sz="3" w:color="E1E6EA"/>
+              <w:bottom w:val="single" w:sz="3" w:color="E1E6EA"/>
+              <w:right w:val="single" w:sz="3" w:color="E1E6EA"/>
+            </w:tcBorders>
+            <w:tcMar>
+              <w:top w:w="130" w:type="dxa"/>
+              <w:start w:w="170" w:type="dxa"/>
+              <w:bottom w:w="130" w:type="dxa"/>
+              <w:end w:w="170" w:type="dxa"/>
+            </w:tcMar>
+            <w:vAlign w:val="center"/>
+          </w:tcPr>
+          <w:p>
+            <w:r>
+              <w:rPr>
+                <w:rFonts w:ascii="Noto Sans CJK SC" w:hAnsi="Noto Sans CJK SC" w:eastAsia="Noto Sans CJK SC"/>
+                <w:b/>
+                <w:color w:val="2F855A"/>
+                <w:sz w:val="16"/>
+              </w:rPr>
+              <w:t xml:space="preserve">CURRENT DECISION  </w:t>
+            </w:r>
+            <w:r>
+              <w:rPr>
+                <w:rFonts w:ascii="Noto Sans CJK SC" w:hAnsi="Noto Sans CJK SC" w:eastAsia="Noto Sans CJK SC"/>
+                <w:b/>
+                <w:color w:val="1F2933"/>
+                <w:sz w:val="21"/>
+              </w:rPr>
+              <w:t>Vendor-neutral integration boundary</w:t>
+            </w:r>
+          </w:p>
+          <w:p>
+            <w:r>
+              <w:rPr>
+                <w:rFonts w:ascii="Noto Sans CJK SC" w:hAnsi="Noto Sans CJK SC" w:eastAsia="Noto Sans CJK SC"/>
+                <w:b w:val="0"/>
+                <w:color w:val="1F2933"/>
+                <w:sz w:val="19"/>
+              </w:rPr>
+              <w:t>RoboGuide Node Protocol 只承载 canonical capability、resource、status 与 execution fact；Robonix、Atlas、Pilot、ROS topic 等本地实现概念不得进入全局协议。每个 capability 的 local owner 必须在本地配置中唯一确定；运行时不得自动切换 owner，对已派发但无法确认状态的 execution 必须进入 reconciliation，禁止自动 replay 物理动作。</w:t>
+            </w:r>
+          </w:p>
+        </w:tc>
+      </w:tr>
+    </w:tbl>
+    <w:p/>
+    <w:p>
+      <w:pPr>
         <w:pStyle w:val="Heading1"/>
         <w:keepNext/>
       </w:pPr>

</xml_diff>